<commit_message>
docs: sync status docs to the verified Mac + real-device state
- Fill the confirmed environment everywhere: iPhone 17 Pro (iOS 26) for the
  real device and Mac Studio (M2 Max / 32 GB, macOS Tahoe 26.0.1, Xcode 26.6)
  for the dev machine
- implementation_status.md: replace the stale "cannot claim done" section
  (never run on Mac/device, 35 cards not fully scanned) with the acceptance
  results; XCTest count corrected to 6 suites / 13 cases
- mac_acceptance_checklist.md: fill the T01-T20 table with results/evidence and
  record the measured accuracy against the gate (93.92%, 0 fabrication)
- README.md: correct Xcode version, simulator destination (iPhone 17 Pro) and
  the real-device statement; link the acceptance record
- spec.md / observation_notes.md / reference_test_suite.md: fill iOS and device
  (only the CamCard reference version still awaits the teacher)
- Report docx: record the dev machine and real-device environment
</commit_message>
<xml_diff>
--- a/BlackBox-项目提交报告.docx
+++ b/BlackBox-项目提交报告.docx
@@ -5253,7 +5253,7 @@
           <w:rFonts w:ascii="Arial" w:hAnsi="Arial" w:eastAsia="PingFang SC"/>
           <w:b w:val="0"/>
         </w:rPr>
-        <w:t>开发机：macOS + Xcode（命令行构建与测试）</w:t>
+        <w:t>开发机：Mac Studio（2023，Apple M2 Max / 32 GB 内存），macOS Tahoe 26.0.1，Xcode 26.6</w:t>
       </w:r>
     </w:p>
     <w:p>
@@ -5266,7 +5266,7 @@
           <w:rFonts w:ascii="Arial" w:hAnsi="Arial" w:eastAsia="PingFang SC"/>
           <w:b w:val="0"/>
         </w:rPr>
-        <w:t>运行环境：iOS Simulator（iPhone 17 Pro，iOS 26.0）Debug 构建；并在真机上人工执行 T01–T20 验收（2026-10-19，确认全部通过）。</w:t>
+        <w:t>运行环境：iOS Simulator（iPhone 17 Pro，iOS 26.0）Debug 构建；并已由人工在 iPhone 17 Pro（iOS 26）真机上执行 T01–T20 验收（2026-10-19，确认全部通过）。</w:t>
       </w:r>
     </w:p>
     <w:p>

</xml_diff>

<commit_message>
docs: add UI comparison deliverable to the submission report
</commit_message>
<xml_diff>
--- a/BlackBox-项目提交报告.docx
+++ b/BlackBox-项目提交报告.docx
@@ -959,6 +959,72 @@
           <w:p>
             <w:r>
               <w:t>已完成</w:t>
+            </w:r>
+            <w:r>
+              <w:rPr>
+                <w:rFonts w:ascii="Arial" w:hAnsi="Arial" w:eastAsia="PingFang SC"/>
+                <w:b w:val="0"/>
+              </w:rPr>
+            </w:r>
+          </w:p>
+        </w:tc>
+      </w:tr>
+      <w:tr>
+        <w:tc>
+          <w:tcPr>
+            <w:tcW w:type="dxa" w:w="2041"/>
+          </w:tcPr>
+          <w:p>
+            <w:r>
+              <w:t>UI 截图对比 / UI Golden Test</w:t>
+            </w:r>
+            <w:r>
+              <w:rPr>
+                <w:rFonts w:ascii="Arial" w:hAnsi="Arial" w:eastAsia="PingFang SC"/>
+                <w:b w:val="0"/>
+              </w:rPr>
+            </w:r>
+          </w:p>
+        </w:tc>
+        <w:tc>
+          <w:tcPr>
+            <w:tcW w:type="dxa" w:w="1814"/>
+          </w:tcPr>
+          <w:p>
+            <w:r>
+              <w:t>并排对比报告（含 7 张参考截图）</w:t>
+            </w:r>
+            <w:r>
+              <w:rPr>
+                <w:rFonts w:ascii="Arial" w:hAnsi="Arial" w:eastAsia="PingFang SC"/>
+                <w:b w:val="0"/>
+              </w:rPr>
+            </w:r>
+          </w:p>
+        </w:tc>
+        <w:tc>
+          <w:tcPr>
+            <w:tcW w:type="dxa" w:w="3742"/>
+          </w:tcPr>
+          <w:p>
+            <w:r>
+              <w:t>UI截图对比报告.docx、BlackBoxSpec/ui_comparison.md、Tests/ReferenceScreenshots/</w:t>
+            </w:r>
+            <w:r>
+              <w:rPr>
+                <w:rFonts w:ascii="Arial" w:hAnsi="Arial" w:eastAsia="PingFang SC"/>
+                <w:b w:val="0"/>
+              </w:rPr>
+            </w:r>
+          </w:p>
+        </w:tc>
+        <w:tc>
+          <w:tcPr>
+            <w:tcW w:type="dxa" w:w="1020"/>
+          </w:tcPr>
+          <w:p>
+            <w:r>
+              <w:t>初步完成（待教师确认参考版本）</w:t>
             </w:r>
             <w:r>
               <w:rPr>

</xml_diff>

<commit_message>
docs: fill black-box observation notes from the CamScanner recording
</commit_message>
<xml_diff>
--- a/BlackBox-项目提交报告.docx
+++ b/BlackBox-项目提交报告.docx
@@ -1025,6 +1025,72 @@
           <w:p>
             <w:r>
               <w:t>初步完成（待教师确认参考版本）</w:t>
+            </w:r>
+            <w:r>
+              <w:rPr>
+                <w:rFonts w:ascii="Arial" w:hAnsi="Arial" w:eastAsia="PingFang SC"/>
+                <w:b w:val="0"/>
+              </w:rPr>
+            </w:r>
+          </w:p>
+        </w:tc>
+      </w:tr>
+      <w:tr>
+        <w:tc>
+          <w:tcPr>
+            <w:tcW w:type="dxa" w:w="2041"/>
+          </w:tcPr>
+          <w:p>
+            <w:r>
+              <w:t>黑盒观察记录</w:t>
+            </w:r>
+            <w:r>
+              <w:rPr>
+                <w:rFonts w:ascii="Arial" w:hAnsi="Arial" w:eastAsia="PingFang SC"/>
+                <w:b w:val="0"/>
+              </w:rPr>
+            </w:r>
+          </w:p>
+        </w:tc>
+        <w:tc>
+          <w:tcPr>
+            <w:tcW w:type="dxa" w:w="1814"/>
+          </w:tcPr>
+          <w:p>
+            <w:r>
+              <w:t>Markdown + 12 张证据帧</w:t>
+            </w:r>
+            <w:r>
+              <w:rPr>
+                <w:rFonts w:ascii="Arial" w:hAnsi="Arial" w:eastAsia="PingFang SC"/>
+                <w:b w:val="0"/>
+              </w:rPr>
+            </w:r>
+          </w:p>
+        </w:tc>
+        <w:tc>
+          <w:tcPr>
+            <w:tcW w:type="dxa" w:w="3742"/>
+          </w:tcPr>
+          <w:p>
+            <w:r>
+              <w:t>BlackBoxSpec/observation_notes.md、Tests/ObservationEvidence/</w:t>
+            </w:r>
+            <w:r>
+              <w:rPr>
+                <w:rFonts w:ascii="Arial" w:hAnsi="Arial" w:eastAsia="PingFang SC"/>
+                <w:b w:val="0"/>
+              </w:rPr>
+            </w:r>
+          </w:p>
+        </w:tc>
+        <w:tc>
+          <w:tcPr>
+            <w:tcW w:type="dxa" w:w="1020"/>
+          </w:tcPr>
+          <w:p>
+            <w:r>
+              <w:t>已完成（参考 App 为 CamScanner，教师同意）</w:t>
             </w:r>
             <w:r>
               <w:rPr>

</xml_diff>